<commit_message>
fix: W02 외부 검토 5건 반영 + 10장 Airmail 세 장
- 10장: Airmail Dress 세 장(人台上身·信封·省道 印字, Commons CC BY-SA 2.0)
- 路线图: 5단 60–75, 6단 75–90「反向设计＋四条裙子＋下周底稿」; 三句话 → 附录 D
- 12장: D栏 문장을 lead 앞으로, 王一扬「茶缸」, 교사용 설명 → 附录 B（续）
  V&A 马可《土地》연결복·외투 소장(无图) 오류 정정, 「埋进土里」→ V&A 著录의 做法
- 24장: 清代刺绣挂毯 통일, 인용 출처(Vogue Runway, Liam Hess, 2026-02)
- 31장: 하단 두 문장만, 나머지 → 附录 C（续）ax03b; 作业 → 底稿
- 讲稿 동기화(配速·10·12·24·30·31·补充 2/4/5)

Co-Authored-By: Claude Opus 5 (1M context) <noreply@anthropic.com>
Claude-Session: https://claude.ai/code/session_01UCELWg5Wp7G1HGyTXZ2y9k
</commit_message>
<xml_diff>
--- a/docs/jiangao/《女装设计》第02周_中国大陆课堂完整讲稿_中文.docx
+++ b/docs/jiangao/《女装设计》第02周_中国大陆课堂完整讲稿_中文.docx
@@ -65,7 +65,7 @@
         <w:pStyle w:val="164"/>
       </w:pPr>
       <w:r>
-        <w:t>配速（45＋45 分钟）　第1课时：热身 3 页 10 分｜六个成见 6 页 ＋ 小结 25 分（每页 3–4 分：成见一句、案例两三句、提问一句，就翻页）｜三层框架与平面造型 2 页 10 分。第2课时：立体 · 细节 · 需求 3 页 15 分｜七种流程 9 页 20 分（导入与总览各 2 分，七页各 2 分左右）｜反向设计与作业 10 分。要守住这个配速只有一条：每页的卡片是给学生看的，不是拿来念的 —— 讲稿里点到的那一两张说完就翻页，其余留给学生课后看。附录十页课上完全不放（课堂模式里本来就是隐藏的），学生自己往后翻。</w:t>
+        <w:t>配速（45＋45 分钟）　第1课时：承上与热身 3 页 10 分｜六个成见 6 页 ＋ 小结 25 分（每页 3–4 分：成见一句、案例两三句、提问一句，就翻页）｜三层框架与平面造型 2 页 10 分。第2课时：立体 · 细节 · 需求 3 页 15 分｜七种流程 10 页 15 分（导入 1 分、七页各 1.5 分左右、第 24 页「流程④ 的今天」2 分、总览 1.5 分）｜反向设计 10 分 ＋ 四条裙子 3 分 ＋ 下周底稿 2 分。要守住这个配速只有一条：每页的卡片是给学生看的，不是拿来念的 —— 讲稿里点到的那一两张说完就翻页，其余留给学生课后看。附录课上完全不放（「本周三句话」也移进了附录）（课堂模式里本来就是隐藏的），学生自己往后翻。</w:t>
       </w:r>
     </w:p>
     <w:p>
@@ -123,7 +123,7 @@
     <w:p>
       <w:pPr/>
       <w:r>
-        <w:t>这一页只花两分钟，但不要跳过。上周我们学的是怎么把一句话说得能被别人核对：把形容词划掉，用三条张力轴去描述一件衣服。今天不换方法，换对象——上周看的是别人的衣服，今天看的是你们自己手上那一条。表格从左往右念一遍就够了。第一行，上周划的是形容词，今天划的是你的手：不思考的时候手会自动画出来的那条裙子。第二行，贴合和离体、垂坠和支撑这两条轴，今天有了名字，叫「立体」，在第 16 页；同一页还会给出体积的四种来源。第三行，暴露和覆盖那条轴，今天落在第 11 页的成见⑤——遮蔽也是一种造型。第四行，四问里的「拆」，今天摊成三层：平面是语法、立体是声音、细节是语气，第 14 页。第五行最重要：原理卡的 D 栏——「保留什么原理，换成什么，用在哪里」——今天就是第 12 页的成见⑥，四个中国设计师，一人一个实例。最后交代一句：请大家把上周课上做的 A3 三栏板和那句立场句放在桌角。第 29 页的活动和第 31 页的底稿都要用到它。按第01周的评分地图，第01、02 周不布置作业、不上传、不打分——但没有它，今天最后那二十分钟你们会从零开始。</w:t>
+        <w:t>这一页只花两分钟，但不要跳过。上周我们学的是怎么把一句话说得能被别人核对：把形容词划掉，用三条张力轴去描述一件衣服。今天不换方法，换对象——上周看的是别人的衣服，今天看的是你们自己手上那一条。表格从左往右念一遍就够了。第一行，上周划的是形容词，今天划的是你的手：不思考的时候手会自动画出来的那条裙子。第二行，贴合和离体、垂坠和支撑这两条轴，今天有了名字，叫「立体」，在第 16 页；同一页还会给出体积的四种来源。第三行，暴露和覆盖那条轴，今天落在第 11 页的成见⑤——遮蔽也是一种造型。第四行，四问里的「拆」，今天摊成三层：平面是语法、立体是声音、细节是语气，第 14 页。第五行最重要：原理卡的 D 栏——「保留什么原理，换成什么，用在哪里」——今天就是第 12 页的成见⑥，四个中国设计师，一人一个实例。最后交代一句：请大家把上周课上做的 A3 三栏板和那句立场句放在桌角。第 29 页的活动和第 31 页的底稿都要用到它。按第01周的评分地图，第01、02 周不布置作业、不上传、不打分——但没有它，今天最后那十五分钟你们会从零开始。</w:t>
       </w:r>
     </w:p>
     <w:p>
@@ -145,7 +145,7 @@
         <w:pStyle w:val="164"/>
       </w:pPr>
       <w:r>
-        <w:t>先看路线图。前十分钟热身，我会让大家画一张图，然后问三个问题。接下来二十五分钟，六个成见、六组反例，国际的和中国的混在一起看。然后回到大纲，把平面、立体、细节三层造型语言讲透——但是用刚才那些案例来讲，不是背定义。第四部分是我最想给大家的：七种设计流程。很多同学以为设计就是"找灵感—画草图—画效果图"一条路，其实全世界的设计师走的是七八条完全不同的路。最后十分钟做一个小活动，布置作业。作业会直接接到第三周的"主题板面"。</w:t>
+        <w:t>先看路线图。前十分钟热身，我会让大家画一张图，然后问三个问题。接下来二十五分钟，六个成见、六组反例，国际的和中国的混在一起看。然后回到大纲，把平面、立体、细节三层造型语言讲透——但是用刚才那些案例来讲，不是背定义。第四部分是我最想给大家的：七种设计流程。很多同学以为设计就是"找灵感—画草图—画效果图"一条路，其实全世界的设计师走的是七八条完全不同的路。最后十五分钟：十分钟把开头那条裙子推翻一次，三分钟看四条已经被人推翻过的裙子，两分钟交代下周的底稿 —— 不上传、不打分，它会直接接到第三周的"主题板面"。</w:t>
       </w:r>
     </w:p>
     <w:p>
@@ -563,7 +563,7 @@
         <w:pStyle w:val="164"/>
       </w:pPr>
       <w:r>
-        <w:t>成见：“衣服是静止的物件”　|　案例：Hussein Chalayan（2000 秋冬 "After Words" · 2007 春夏 "One Hundred and Eleven"）</w:t>
+        <w:t>成见：“衣服是静止的物件”　|　案例：Hussein Chalayan（1999 Airmail Dress · 2000 秋冬 "After Words" · 2007 春夏 "One Hundred and Eleven"）</w:t>
       </w:r>
     </w:p>
     <w:p>
@@ -609,7 +609,7 @@
         <w:pStyle w:val="164"/>
       </w:pPr>
       <w:r>
-        <w:t>第四个成见：衣服是静止的。看 Chalayan。二〇〇〇年秋冬那场秀，舞台上是一个客厅，模特把椅套脱下来穿在身上变成裙子，最后一个模特走到桌子中间，把桌子提起来，桌子变成一条木头的圆桌裙。这个系列的背景是他家族在塞浦路斯经历的战争与迁徙——当你必须逃离的时候，你能带走什么？衣服可以是你带走的家。二〇〇七年他更进一步，裙子里装了机械，在台上自动从一九〇〇年代的廓形变到二〇〇〇年代。请大家记住这个概念：衣服不一定只有一个"完成的样子"，它可以有时间。这对我们后面讲"系列设计"很重要——系列不只是同一个主题的十件衣服，也可以是同一件衣服的十个阶段。</w:t>
+        <w:t>第四个成见：衣服是静止的。看 Chalayan。屏幕上前三张是同一件 Airmail Dress，一九九九年，用 Tyvek —— 一种像纸一样的合成材料 —— 做的。第一张穿在人台上，是一件无袖连衣裙；请学生找领口旁边印着的“fold 3”和那一列小三角：折到哪一步，都编了号。第二张是它折好的样子：一只航空信封，信封盖上印着一句“这几片盖子可以撕掉，方便穿”。第三张是衣身上的一处特写：三条线收到一个点，那是一个省道，旁边印着“沿省道中线折叠，改善合身度，用贴纸或缝线固定”。第 15 页要学的省道，这件衣服自己印在身上教你。二〇〇〇年秋冬那场秀，舞台上是一个客厅，模特把椅套脱下来穿在身上变成裙子，最后一个模特走到桌子中间，把桌子提起来，桌子变成一条木头的圆桌裙。这个系列的背景是他家族在塞浦路斯经历的战争与迁徙——当你必须逃离的时候，你能带走什么？衣服可以是你带走的家。二〇〇七年他更进一步，裙子里装了机械，在台上自动从一九〇〇年代的廓形变到二〇〇〇年代（屏幕上第四张不是那几套，是同一场的另一套 —— 那几套请口述或放视频）。请大家记住这个概念：衣服不一定只有一个"完成的样子"，它可以有时间。这对我们后面讲"系列设计"很重要——系列不只是同一个主题的十件衣服，也可以是同一件衣服的十个阶段。</w:t>
       </w:r>
     </w:p>
     <w:p>
@@ -771,7 +771,7 @@
         <w:pStyle w:val="165"/>
       </w:pPr>
       <w:r>
-        <w:t>· 把衣服埋进土里、交给时间；手织、手染、手缝</w:t>
+        <w:t>· 布面涂上石膏浆再揉搓，做出冰裂一样的纹（V&amp;A 著录）；手纺、手织、手染、手缝</w:t>
       </w:r>
     </w:p>
     <w:p>
@@ -841,7 +841,7 @@
         <w:pStyle w:val="164"/>
       </w:pPr>
       <w:r>
-        <w:t>第六个成见，也是我最想跟大家谈的：中国元素等于旗袍、龙凤、红色、盘扣。每年都有同学做「中国风」系列，做出来像景区纪念品。所以这一页我先放一张反面的：北京一家商场里的旗袍——立领下面一颗盘扣，黑滚边沿着斜襟从领口一直走到腋下，红底花卉，侧面开衩。四样一次到齐。我不是说它不好，我是说：你换个颜色、换一朵花，它还是同一件衣服。这就是符号——可以替换，但不生长。右边四张，没有一张用这些，而且四个人各走一条路。马可，先是「例外」的创始人之一，二〇〇六年创立「无用」，二〇〇七年在巴黎时装周发布《无用之土地》——她把衣服埋进土里，让泥土和时间在衣服上留下痕迹，所有东西都是手织、手染、手缝。她的入口是手与时间。Uma Wang，东华大学毕业后去 CSM 进修，二〇〇九年创立品牌。她的入口是材料的年龄：先把布做旧、洗水、混纺，让布先有「年龄」，再做松弛的、包裹式的廓形。第三张是上下的蒋琼耳，二〇一三年的《Sculpture》系列外套，V&amp;A 的藏品，而且是平铺拍的——第 15 页你们会看到汉代的十字型平面结构 —— 那一件是「裁」出来的，这一件是「擀」出来的。形状接近，做法完全不同，请不要把两者说成一回事。请先看它是怎么做出来的：手工擀毡，羊毛直接压成布，不是织出来的。毡没有经纬，也不会脱散，所以不需要缝份，也不需要卷边。你看袖子——它从衣身直接长出来，肩膀上没有接缝；再看边缘——领口、门襟、下摆、袖口，全是毡到哪里就停在哪里，一针也没有。那条黄线不是后来滚上去的边，是擀毡的时候就把黄色羊毛一起擀进去的。右衽交领，用系带收，不用扣子。整件衣服上一个纹样也没有。她的入口是「不裁」——先决定用什么办法做布，布的性格再决定衣服能长成什么样。顺便说一句 V&amp;A 写的产地：蒙古。擀毡是草原的手艺。所以这件衣服说「中国」的方式，是工艺加上交领系带的文法，不是龙凤和红色。第四张是王一扬，上海设计师，V&amp;A 还藏有他「茶缸」品牌的东西。这件是他二〇〇五年《灰》系列里的棉大衣，也是 V&amp;A 的藏品。通身灰，一处纹样也没有，全身絮了棉，两排包布的大扣子。请注意 V&amp;A 的著录是怎么写的——灵感来自中国传统劳动服装的颜色、肌理和布。他的入口是颜色的出处。请把这一条跟第一张对照着想：谁说中国色就是红色？所以回到第一张：符号可以换，原理换不掉。这也是我们大纲里「课程思政」要求的——中式女装美学不是贴符号，而是理解它背后的原理：平面裁剪的十字型结构、衣与身之间的空间、材料本身的质感、时间的痕迹。</w:t>
+        <w:t>第六个成见，也是我最想跟大家谈的：中国元素等于旗袍、龙凤、红色、盘扣。请把上周原理卡的 D 栏拿出来 ——「保留 ___ 原理，换成 ___，用在 ___」，右边四张就是四个填好的实例。每年都有同学做「中国风」系列，做出来像景区纪念品。所以这一页我先放一张反面的：北京一家商场里的旗袍——立领下面一颗盘扣，黑滚边沿着斜襟从领口一直走到腋下，红底花卉，侧面开衩。四样一次到齐。我不是说它不好，我是说：你换个颜色、换一朵花，它还是同一件衣服。这就是符号——可以替换，但不生长。右边四张，没有一张用这些，而且四个人各走一条路。马可，先是「例外」的创始人之一，二〇〇六年创立「无用」，二〇〇七年在巴黎时装周发布《无用之土地》——V&amp;A 藏着《土地》里的一件连衣裙和一件外套，著录写得很具体：连衣裙的布面先涂上石膏浆，再揉、再搓，做出冰裂一样的纹；外套是用几块回收的涤纶布拼起来的，满身污渍和补丁 —— 她要的就是「无用」。做这些衣服的人会纺、会织、会染、会缝，用的都是老办法。可惜这两件在线目录里没有图，所以屏幕上这一格是她二〇一九年的一双手工编织鞋：同一条路，但不是《土地》本身。她的入口是手与时间。Uma Wang，东华大学毕业后去 CSM 进修，二〇〇九年创立品牌。她的入口是材料的年龄：先把布做旧、洗水、混纺，让布先有「年龄」，再做松弛的、包裹式的廓形。第三张是上下的蒋琼耳，二〇一三年的《Sculpture》系列外套，V&amp;A 的藏品，而且是平铺拍的——第 15 页你们会看到汉代的十字型平面结构 —— 那一件是「裁」出来的，这一件是「擀」出来的。形状接近，做法完全不同，请不要把两者说成一回事。请先看它是怎么做出来的：手工擀毡，羊毛直接压成布，不是织出来的。毡没有经纬，也不会脱散，所以不需要缝份，也不需要卷边。你看袖子——它从衣身直接长出来，肩膀上没有接缝；再看边缘——领口、门襟、下摆、袖口，全是毡到哪里就停在哪里，一针也没有。那条黄线不是后来滚上去的边，是擀毡的时候就把黄色羊毛一起擀进去的。右衽交领，用系带收，不用扣子。整件衣服上一个纹样也没有。她的入口是「不裁」——先决定用什么办法做布，布的性格再决定衣服能长成什么样。顺便说一句 V&amp;A 写的产地：蒙古。擀毡是草原的手艺。所以这件衣服说「中国」的方式，是工艺加上交领系带的文法，不是龙凤和红色。第四张是王一扬，上海设计师，V&amp;A 还藏有他「茶缸」品牌的东西。这件是他二〇〇五年《灰》系列里的棉大衣，也是 V&amp;A 的藏品。通身灰，一处纹样也没有，全身絮了棉，两排包布的大扣子。请注意 V&amp;A 的著录是怎么写的——灵感来自中国传统劳动服装的颜色、肌理和布。他的入口是颜色的出处。请把这一条跟第一张对照着想：谁说中国色就是红色？所以回到第一张：符号可以换，原理换不掉。这也是我们大纲里「课程思政」要求的——中式女装美学不是贴符号，而是理解它背后的原理：平面裁剪的十字型结构、衣与身之间的空间、材料本身的质感、时间的痕迹。</w:t>
       </w:r>
     </w:p>
     <w:p>
@@ -1417,7 +1417,7 @@
         <w:pStyle w:val="164"/>
       </w:pPr>
       <w:r>
-        <w:t>第三部分，七种设计流程。我先说结论：世界上没有唯一正确的设计流程。教科书上"灵感—草图—效果图—打版—成衣"只是其中一条，而且它经常让人卡在第一步——"我没有灵感"。其实所有流程的差别只在"入口"：你从哪里进入设计。有人从调研进，有人从面料进，有人从人台进，有人从旧衣服进，有人从故事进，有人从市场进，有人从手艺进。下面七种，每种我给一个流程图和一两个代表设计师，请大家边看边想：我自己最顺手的入口是哪一个？还有一句要先说：这七页里，每一页的后面都跟着一页附录，题目是——这一步要拿出什么东西来。课上不放，课后你们自己往后翻一页；选了哪条路，就照那一页一格一格对照自己的作业，每一格问的都是同一件事：到这一步，你手上应该出现什么。</w:t>
+        <w:t>第三部分，七种设计流程。我先说结论：世界上没有唯一正确的设计流程。教科书上"灵感—草图—效果图—打版—成衣"只是其中一条，而且它经常让人卡在第一步——"我没有灵感"。其实所有流程的差别只在"入口"：你从哪里进入设计。有人从调研进，有人从面料进，有人从人台进，有人从旧衣服进，有人从故事进，有人从市场进，有人从手艺进。下面七种，每种我给一个流程图和一两个代表设计师，请大家边看边想：我自己最顺手的入口是哪一个？还有一句要先说：这七页里，每一页的后面都跟着一页附录，题目是——这一步要拿出什么东西来。课上不放，课后你们自己往后翻一页；选了哪条路，就照那一页一格一格对照自己的底稿，每一格问的都是同一件事：到这一步，你手上应该出现什么。</w:t>
       </w:r>
     </w:p>
     <w:p>
@@ -1673,7 +1673,7 @@
         <w:pStyle w:val="164"/>
       </w:pPr>
       <w:r>
-        <w:t>上一页讲的全是 1997 年。学生心里会嘀咕：那是三十年前的实验，跟我有什么关系。这一页就是回答这句话的 —— 屏幕上四件都是 2026 年秋冬伦敦时装周的成衣，走的还是刚才那六步。第一件和第二件是 Conner Ives。第一件外套的布是清代的刺绣挂毯，被裁开重新排版做成外套；请学生看那只鹤：鹤的身子压在门襟上，翅膀跨到了右前片 —— 如果是照着这件衣服绣的，绣工不会让图案从正中断开。所以是先有绣好的布，再在布上排版，这就是第三步「错置、重组」的实物证据。第二件是一条旧丝巾：压褶之后斜着拉过胯部，丝巾自己的印花边框现在竖着落在侧面，丝巾的一个角落到了下摆 —— 那一小块绿色就是。第三件和第四件是 Chopova Lowena。第三件是他们的招牌：裙子由两幅完全不同的褶料在正中撞在一起，接缝不缝死，用一排登山扣挂在皮带上 —— 第五步「保留多少原来的痕迹」，他们的答案是「干脆不藏」。第四件是同一套的上身，请学生数格子：正中一种大格，两侧的格子细得多，泡泡袖上又是第三种，肩上那圈打褶的饰边是第四种 —— 一件上衣里四种格子，方格大小全不一样。再看正中：一整条门襟和一排包扣，从领口一直通到下摆。第三件是把接缝亮出来，这一件是把四块不一样的料收成一个上身 —— 同一条路，两种不同的处理。最后一定要讲这一句：Conner Ives 自己说那件清代刺绣外套「是我们款单上最贵的一件，同时也是眼下最好卖的一件」。学生最常问的是「做这么费工的东西卖得掉吗」，这就是答案；把它和第 26 页的市场先行放在一起看 —— 入口不同，两条路最后都要过订货会。还有一个问题要抛出来，不要回避：清代的挂毯被一个英国设计师裁开做成外套，这是保留了原理，还是只拿走了符号？回到第 12 页那把尺子，让学生自己判断 —— 老师不给标准答案，但要求他们说出依据。</w:t>
+        <w:t>上一页讲的全是 1997 年。学生心里会嘀咕：那是三十年前的实验，跟我有什么关系。这一页就是回答这句话的 —— 屏幕上四件都是 2026 年秋冬伦敦时装周的成衣，走的还是刚才那六步。第一件和第二件是 Conner Ives。第一件外套的布是清代的刺绣挂毯，被裁开重新排版做成外套；请学生看那只鹤：鹤的身子压在门襟上，翅膀跨到了右前片 —— 如果是照着这件衣服绣的，绣工不会让图案从正中断开。所以是先有绣好的布，再在布上排版，这就是第三步「错置、重组」的实物证据。第二件是一条旧丝巾：压褶之后斜着拉过胯部，丝巾自己的印花边框现在竖着落在侧面，丝巾的一个角落到了下摆 —— 那一小块绿色就是。第三件和第四件是 Chopova Lowena。第三件是他们的招牌：裙子由两幅完全不同的褶料在正中撞在一起，接缝不缝死，用一排登山扣挂在皮带上 —— 第五步「保留多少原来的痕迹」，他们的答案是「干脆不藏」。第四件是同一套的上身，请学生数格子：正中一种大格，两侧的格子细得多，泡泡袖上又是第三种，肩上那圈打褶的饰边是第四种 —— 一件上衣里四种格子，方格大小全不一样。再看正中：一整条门襟和一排包扣，从领口一直通到下摆。第三件是把接缝亮出来，这一件是把四块不一样的料收成一个上身 —— 同一条路，两种不同的处理。最后一定要讲这一句：Conner Ives 自己说那件清代刺绣挂毯改的外套「是我们款单上最贵的一件，同时也是眼下最好卖的一件」—— 出自 Vogue Runway 的秀评（Liam Hess，2026 年 2 月），学生问出处就这样答。学生最常问的是「做这么费工的东西卖得掉吗」，这就是答案；把它和第 26 页的市场先行放在一起看 —— 入口不同，两条路最后都要过订货会。还有一个问题要抛出来，不要回避：清代的刺绣挂毯被一位在伦敦做品牌的美国设计师裁开做成外套，这是保留了原理，还是只拿走了符号？回到第 12 页那把尺子，让学生自己判断 —— 老师不给标准答案，但要求他们说出依据。</w:t>
       </w:r>
     </w:p>
     <w:p>
@@ -1883,7 +1883,7 @@
         <w:pStyle w:val="164"/>
       </w:pPr>
       <w:r>
-        <w:t>把七种放在一起看。入口完全不同：调研、面料、人台、旧衣、故事、市场、手艺。但请看中间这个环——不管你从哪个入口进来，中间都要经过四步：研究、实验、筛选、完成。研究是弄清楚；实验是做试样，动手；筛选是删掉，把五十张草图删到五张；完成是把它做出来。屏幕上这张表，一行是一条路，一列是一个站，格子里的数字是这条路的第几步。打红圈的那个1就是入口——你看，它在每一行落在不同的列上，这就是"入口不同"。再看②面料先行、③立裁、⑤叙事概念、⑦文化手艺这四行，数字会往回走：面料先行是先动手做，再回头弄懂布的脾气；立裁干脆从人台开始；手艺这条路是先想清楚它在今天生活里的位置，再动手做；叙事这条路写完设计陈述之后还要回去做试样。所以顺序并不相同。相同的是——七行里没有一个空格，四个站一个都没被跳过。很多同学的问题不是没有入口，而是缺了"实验"和"筛选"这两步——直接从草图跳到效果图，中间没有试样，也没有删减。那不是设计，那是画画。今天回去，请大家想清楚自己最顺手的入口是哪一个；作业里要写。</w:t>
+        <w:t>把七种放在一起看。入口完全不同：调研、面料、人台、旧衣、故事、市场、手艺。但请看中间这个环——不管你从哪个入口进来，中间都要经过四步：研究、实验、筛选、完成。研究是弄清楚；实验是做试样，动手；筛选是删掉，把五十张草图删到五张；完成是把它做出来。屏幕上这张表，一行是一条路，一列是一个站，格子里的数字是这条路的第几步。打红圈的那个1就是入口——你看，它在每一行落在不同的列上，这就是"入口不同"。再看②面料先行、③立裁、⑤叙事概念、⑦文化手艺这四行，数字会往回走：面料先行是先动手做，再回头弄懂布的脾气；立裁干脆从人台开始；手艺这条路是先想清楚它在今天生活里的位置，再动手做；叙事这条路写完设计陈述之后还要回去做试样。所以顺序并不相同。相同的是——七行里没有一个空格，四个站一个都没被跳过。很多同学的问题不是没有入口，而是缺了"实验"和"筛选"这两步——直接从草图跳到效果图，中间没有试样，也没有删减。那不是设计，那是画画。今天回去，请大家想清楚自己最顺手的入口是哪一个；底稿里要写。</w:t>
       </w:r>
     </w:p>
     <w:p>
@@ -1953,7 +1953,7 @@
         <w:pStyle w:val="164"/>
       </w:pPr>
       <w:r>
-        <w:t>刚才十分钟，你们每个人把自己那条裙子推翻了一次。现在看看别人把它推到哪里去了。第 05 页我问了三个问题，第三个一直没有回答：裙子还能成为什么。这四件都是裙子，都在同一个博物馆——V&amp;A。它们换掉的不是样子，是「裙子是什么」这个问题本身。第一件，一八七一年英国的笼式裙撑。请注意：一块布也没有，裙子的形已经在了。横向的钢箍越往下越大，竖的布带把它们一条条串住，全部吊在一条腰带上。V&amp;A 的著录里说，这类东西当年被叫作「骨架衬裙」。形由结构决定，布只是蒙上去的那一层——这是「体积从哪里来」的极端答案，请和第 16 页一起想。第二件，清代的马面裙，一八五〇到一九〇〇年，摊平拍的。一条白腰头上挂着两片，中间叠在一起；每一片都是一块平的加一块打褶的。穿的时候一绕，平的两块落在前后，褶甩到两侧去。一个省道也没有——形是「哪里打褶、哪里不打」定的。这一件请和第 15 页的十字型、第 12 页第三格上下的毡放在一起看：四张都是摊平拍的，十字型是裁的结果，毡是擀的结果，马面裙是折的结果，下面那件纸裙是切的结果。同一个视角，四种做法。第三件，一九六七年伦敦 Dispo 的纸裙。一整片扇形，腰上两个襻、一根绳，看不到拉链，也看不到纽扣，下摆就这么切开，没有卷边。材料是压合的纤维素纤维。当年《Which》杂志的消费测试说它能穿至少六次。请记住这个数字：把「能穿几次」放进设计条件里，形就只需要一片。这也是第01周讲的六个维度里「技术与可持续」那一条真正的样子——不是画个绿色图案。第四件，印度设计师 Rimzim Dadu，二〇一四年。廓形是最普通的直筒铅笔裙，一处新意也没有；功夫全在面上——把皮革搓成细条，一根一根缝上去，拼出 patola 的纹。V&amp;A 写她的做法是「引用，而不是直接拿来用」。又是原理，不是符号，和第 12 页说的是同一件事。最后问一句，然后进作业：刚才那十分钟，你推翻的是哪一条？他们推翻的又是哪一条？</w:t>
+        <w:t>刚才十分钟，你们每个人把自己那条裙子推翻了一次。现在看看别人把它推到哪里去了。第 05 页我问了三个问题，第三个一直没有回答：裙子还能成为什么。这四件都是裙子，都在同一个博物馆——V&amp;A。它们换掉的不是样子，是「裙子是什么」这个问题本身。第一件，一八七一年英国的笼式裙撑。请注意：一块布也没有，裙子的形已经在了。横向的钢箍越往下越大，竖的布带把它们一条条串住，全部吊在一条腰带上。V&amp;A 的著录里说，这类东西当年被叫作「骨架衬裙」。形由结构决定，布只是蒙上去的那一层——这是「体积从哪里来」的极端答案，请和第 16 页一起想。第二件，清代的马面裙，一八五〇到一九〇〇年，摊平拍的。一条白腰头上挂着两片，中间叠在一起；每一片都是一块平的加一块打褶的。穿的时候一绕，平的两块落在前后，褶甩到两侧去。一个省道也没有——形是「哪里打褶、哪里不打」定的。这一件请和第 15 页的十字型、第 12 页第三格上下的毡放在一起看：四张都是摊平拍的，十字型是裁的结果，毡是擀的结果，马面裙是折的结果，下面那件纸裙是切的结果。同一个视角，四种做法。第三件，一九六七年伦敦 Dispo 的纸裙。一整片扇形，腰上两个襻、一根绳，看不到拉链，也看不到纽扣，下摆就这么切开，没有卷边。材料是压合的纤维素纤维。当年《Which》杂志的消费测试说它能穿至少六次。请记住这个数字：把「能穿几次」放进设计条件里，形就只需要一片。这也是第01周讲的六个维度里「技术与可持续」那一条真正的样子——不是画个绿色图案。第四件，印度设计师 Rimzim Dadu，二〇一四年。廓形是最普通的直筒铅笔裙，一处新意也没有；功夫全在面上——把皮革搓成细条，一根一根缝上去，拼出 patola 的纹。V&amp;A 写她的做法是「引用，而不是直接拿来用」。又是原理，不是符号，和第 12 页说的是同一件事。最后问一句，然后交代下周的底稿：刚才那十分钟，你推翻的是哪一条？他们推翻的又是哪一条？</w:t>
       </w:r>
     </w:p>
     <w:p>
@@ -2007,7 +2007,7 @@
         <w:pStyle w:val="164"/>
       </w:pPr>
       <w:r>
-        <w:t>作业。一张 A3，题目叫"我的时装世界"，下周带来。四个部分。第一，写你自己身上的三个成见，每个配一张打破它的参考图，至少一张是中国设计师的。第二，从七种流程里选一种或者组合，画你自己的流程图，标出你最强和最弱的一步——这个诚实很重要。第三，白布问题：如果只给你白布，你的裙子会是什么，一张草图加一句话。第四，十张参考图，至少三张中国、三张国际、一张非时装——建筑、器物、自然都行——每张写一句：我看中它的哪一层造型语言，平面、立体还是细节。这一页不上传、也不打分——按第01周的评分地图，第01、02 周不布置作业。四个百分比是给你自己对照用的权重，看看哪一块做薄了。它真正的去处是第03周的“灵感与主题板面”，也就是平时作业 1，十五分，直接从这一页长出来，所以请认真做。还有，上周 Exit Ticket 你们写的那句「第02周我将用什么图、什么立体测试去验证」，今天在这里收回：「用什么去验」就是第二项的流程图，你那条路上的“筛选”和“完成”两站放的就是验证动作；图和立体的实际验证从第03到04周的主题板面开始，到第08周的款式图评审交账。</w:t>
+        <w:t>下周的底稿。一张 A3，题目叫"我的时装世界"，下周带来。四个部分。第一，写你自己身上的三个成见，每个配一张打破它的参考图，至少一张是中国设计师的。第二，从七种流程里选一种或者组合，画你自己的流程图，标出你最强和最弱的一步——这个诚实很重要。第三，白布问题：如果只给你白布，你的裙子会是什么，一张草图加一句话。第四，十张参考图，至少三张中国、三张国际、一张非时装——建筑、器物、自然都行——每张写一句：我看中它的哪一层造型语言，平面、立体还是细节。这一页不上传、也不打分——按第01周的评分地图，第01、02 周不布置作业。四个百分比是给你自己对照用的权重，看看哪一块做薄了。它真正的去处是第03周的“灵感与主题板面”，也就是平时作业 1，十五分，直接从这一页长出来，所以请认真做。上周 Exit Ticket 那句「用什么去验」怎么在这里收回、做第二项和第一、四项时怎么对照，都移到了附录 C 的下一页，课上不讲，请学生自己翻。下周第三章，风格与主题，请把 A3 带来。下课。</w:t>
       </w:r>
     </w:p>
     <w:p>
@@ -2015,7 +2015,21 @@
         <w:pStyle w:val="166"/>
       </w:pPr>
       <w:r>
-        <w:t>幻灯片 32｜本周三句话</w:t>
+        <w:t>补充 1｜本周教学内容与课程大纲的对应关系</w:t>
+      </w:r>
+    </w:p>
+    <w:p>
+      <w:pPr/>
+      <w:r>
+        <w:t>【讲稿】</w:t>
+      </w:r>
+    </w:p>
+    <w:p>
+      <w:pPr>
+        <w:pStyle w:val="164"/>
+      </w:pPr>
+      <w:r>
+        <w:t>这一页是给老师自己核对用的：大纲要求的每一条，本周落在哪一页。</w:t>
       </w:r>
     </w:p>
     <w:p>
@@ -2023,6 +2037,166 @@
         <w:pStyle w:val="165"/>
       </w:pPr>
       <w:r>
+        <w:t>· 重点：掌握平面、立体造型方法 ── 以案例讲三层造型语言，并各配一个课堂提问（PPT 13、14、15）</w:t>
+      </w:r>
+    </w:p>
+    <w:p>
+      <w:pPr>
+        <w:pStyle w:val="165"/>
+      </w:pPr>
+      <w:r>
+        <w:t>· 重点：理解细节的情感传递 ── Simone Rocha / Margiela / 盘扣再设计：尺度、数量、位置（PPT 16）</w:t>
+      </w:r>
+    </w:p>
+    <w:p>
+      <w:pPr>
+        <w:pStyle w:val="165"/>
+      </w:pPr>
+      <w:r>
+        <w:t>· 难点：立体造型实践 ── 立裁/身体先行流程；建议第三周起在人台上试样（PPT 15、21）</w:t>
+      </w:r>
+    </w:p>
+    <w:p>
+      <w:pPr>
+        <w:pStyle w:val="165"/>
+      </w:pPr>
+      <w:r>
+        <w:t>· 难点：造型与女性需求的精准对接 ── 功能 / 情绪 / 身份三类需求表；"打破成见 ≠ 为怪而怪"（PPT 17）</w:t>
+      </w:r>
+    </w:p>
+    <w:p>
+      <w:pPr>
+        <w:pStyle w:val="165"/>
+      </w:pPr>
+      <w:r>
+        <w:t>· 课程思政：中式女装美学原理 ── 马可 / Uma Wang / Susan Fang / 陈序之；十字型平面结构；原理而非符号（PPT 11、14、25）</w:t>
+      </w:r>
+    </w:p>
+    <w:p>
+      <w:pPr>
+        <w:pStyle w:val="165"/>
+      </w:pPr>
+      <w:r>
+        <w:t>· 期末考核：市场性与准确定位（20 分） ── 流程⑥ 市场 / 产品先行型（PPT 24）</w:t>
+      </w:r>
+    </w:p>
+    <w:p>
+      <w:pPr>
+        <w:pStyle w:val="166"/>
+      </w:pPr>
+      <w:r>
+        <w:t>补充 2｜本课所用图像的来源与版权说明</w:t>
+      </w:r>
+    </w:p>
+    <w:p>
+      <w:pPr/>
+      <w:r>
+        <w:t>【讲稿】</w:t>
+      </w:r>
+    </w:p>
+    <w:p>
+      <w:pPr>
+        <w:pStyle w:val="164"/>
+      </w:pPr>
+      <w:r>
+        <w:t>这一页不用讲，但要留着 —— 学生问「这张图哪来的」时直接翻到这里。本课的图像分四类来源：Wikimedia Commons 的自由许可图、V&amp;A 与 MoMu 两家博物馆的藏品页、品牌官方在线商店，以及 Vogue Runway 的秀场图（署名，仅用于课堂工序观察）。</w:t>
+      </w:r>
+    </w:p>
+    <w:p>
+      <w:pPr>
+        <w:pStyle w:val="166"/>
+      </w:pPr>
+      <w:r>
+        <w:t>补充 3｜其余来源，与两条需要说明的例外</w:t>
+      </w:r>
+    </w:p>
+    <w:p>
+      <w:pPr/>
+      <w:r>
+        <w:t>【讲稿】</w:t>
+      </w:r>
+    </w:p>
+    <w:p>
+      <w:pPr>
+        <w:pStyle w:val="164"/>
+      </w:pPr>
+      <w:r>
+        <w:t>附录 B 的来源表原来是一页八行，最后一行一直被底部的工具条挡住 —— 2026 年 9 月拆成了两页。这一页上半是来源表的后两行，下半是原来压在附录 B 下面的那两块说明。备课时记住两件事就够了：哪些图没有拿到授权、我用什么替代了它；以及 Chalayan 那两条 —— Airmail 的年代本课取 1999，两段最有名的画面本课没有图，要口述或放视频。</w:t>
+      </w:r>
+    </w:p>
+    <w:p>
+      <w:pPr>
+        <w:pStyle w:val="166"/>
+      </w:pPr>
+      <w:r>
+        <w:t>补充 4｜“反向设计”活动的进行方式与底稿自查点</w:t>
+      </w:r>
+    </w:p>
+    <w:p>
+      <w:pPr/>
+      <w:r>
+        <w:t>【讲稿】</w:t>
+      </w:r>
+    </w:p>
+    <w:p>
+      <w:pPr>
+        <w:pStyle w:val="164"/>
+      </w:pPr>
+      <w:r>
+        <w:t>活动完全依赖开头热身画的那条裙子，所以第一句话就要提醒学生别把纸扔了。附录 C 后面还有一页（续），是从第 31 页移过来的三条提醒 —— Exit Ticket 在哪里收回、做第二项和第一、四项时怎么对照 —— 不用讲，学生做底稿时自己翻。</w:t>
+      </w:r>
+    </w:p>
+    <w:p>
+      <w:pPr/>
+      <w:r>
+        <w:t>【底稿四块的自查口径（不打分）】</w:t>
+      </w:r>
+    </w:p>
+    <w:p>
+      <w:pPr>
+        <w:pStyle w:val="165"/>
+      </w:pPr>
+      <w:r>
+        <w:t>· 三个成见＋反例图（30%）：成见是否真的是自己的（而不是抄课件）；反例是否真能对应该成见。</w:t>
+      </w:r>
+    </w:p>
+    <w:p>
+      <w:pPr>
+        <w:pStyle w:val="165"/>
+      </w:pPr>
+      <w:r>
+        <w:t>· 我的入口流程图（25%）：是否从七种里做出选择并说明理由；是否诚实标出最弱的一步。</w:t>
+      </w:r>
+    </w:p>
+    <w:p>
+      <w:pPr>
+        <w:pStyle w:val="165"/>
+      </w:pPr>
+      <w:r>
+        <w:t>· 白布问题草图（20%）：是否有明确的造型决定（廓形 / 体积 / 细节至少一层）。</w:t>
+      </w:r>
+    </w:p>
+    <w:p>
+      <w:pPr>
+        <w:pStyle w:val="165"/>
+      </w:pPr>
+      <w:r>
+        <w:t>· 10 张参考图（25%）：中国 ≥3、国际 ≥3、非时装 ≥1；一句话是否指向某一层造型语言，而不是泛泛的「好看」。</w:t>
+      </w:r>
+    </w:p>
+    <w:p>
+      <w:pPr>
+        <w:pStyle w:val="166"/>
+      </w:pPr>
+      <w:r>
+        <w:t>补充 5｜本周三句话</w:t>
+      </w:r>
+    </w:p>
+    <w:p>
+      <w:pPr>
+        <w:pStyle w:val="165"/>
+      </w:pPr>
+      <w:r>
         <w:t>· 成见不是错误，只是被当成了唯一答案。</w:t>
       </w:r>
     </w:p>
@@ -2053,181 +2227,7 @@
         <w:pStyle w:val="164"/>
       </w:pPr>
       <w:r>
-        <w:t>最后三句话。第一，成见不是错误，只是被当成了唯一答案——你今天看到的每个案例，都是有人把"唯一"变成了"之一"。第二，造型语言有三层：平面是语法，立体是声音，细节是语气；三层同时说话，才是一件完整的衣服。第三，设计的路不止一条，七个入口任你选，但每条路中间都要经过实验和筛选，跳过这两步就只是画画。下周第三章，风格与主题，请把 A3 带来。下课。</w:t>
-      </w:r>
-    </w:p>
-    <w:p>
-      <w:pPr>
-        <w:pStyle w:val="166"/>
-      </w:pPr>
-      <w:r>
-        <w:t>补充 1｜本周教学内容与课程大纲的对应关系</w:t>
-      </w:r>
-    </w:p>
-    <w:p>
-      <w:pPr/>
-      <w:r>
-        <w:t>【讲稿】</w:t>
-      </w:r>
-    </w:p>
-    <w:p>
-      <w:pPr>
-        <w:pStyle w:val="164"/>
-      </w:pPr>
-      <w:r>
-        <w:t>这一页是给老师自己核对用的：大纲要求的每一条，本周落在哪一页。</w:t>
-      </w:r>
-    </w:p>
-    <w:p>
-      <w:pPr>
-        <w:pStyle w:val="165"/>
-      </w:pPr>
-      <w:r>
-        <w:t>· 重点：掌握平面、立体造型方法 ── 以案例讲三层造型语言，并各配一个课堂提问（PPT 13、14、15）</w:t>
-      </w:r>
-    </w:p>
-    <w:p>
-      <w:pPr>
-        <w:pStyle w:val="165"/>
-      </w:pPr>
-      <w:r>
-        <w:t>· 重点：理解细节的情感传递 ── Simone Rocha / Margiela / 盘扣再设计：尺度、数量、位置（PPT 16）</w:t>
-      </w:r>
-    </w:p>
-    <w:p>
-      <w:pPr>
-        <w:pStyle w:val="165"/>
-      </w:pPr>
-      <w:r>
-        <w:t>· 难点：立体造型实践 ── 立裁/身体先行流程；建议第三周起在人台上试样（PPT 15、21）</w:t>
-      </w:r>
-    </w:p>
-    <w:p>
-      <w:pPr>
-        <w:pStyle w:val="165"/>
-      </w:pPr>
-      <w:r>
-        <w:t>· 难点：造型与女性需求的精准对接 ── 功能 / 情绪 / 身份三类需求表；"打破成见 ≠ 为怪而怪"（PPT 17）</w:t>
-      </w:r>
-    </w:p>
-    <w:p>
-      <w:pPr>
-        <w:pStyle w:val="165"/>
-      </w:pPr>
-      <w:r>
-        <w:t>· 课程思政：中式女装美学原理 ── 马可 / Uma Wang / Susan Fang / 陈序之；十字型平面结构；原理而非符号（PPT 11、14、25）</w:t>
-      </w:r>
-    </w:p>
-    <w:p>
-      <w:pPr>
-        <w:pStyle w:val="165"/>
-      </w:pPr>
-      <w:r>
-        <w:t>· 期末考核：市场性与准确定位（20 分） ── 流程⑥ 市场 / 产品先行型（PPT 24）</w:t>
-      </w:r>
-    </w:p>
-    <w:p>
-      <w:pPr>
-        <w:pStyle w:val="166"/>
-      </w:pPr>
-      <w:r>
-        <w:t>补充 2｜本课所用图像的来源与版权说明</w:t>
-      </w:r>
-    </w:p>
-    <w:p>
-      <w:pPr/>
-      <w:r>
-        <w:t>【讲稿】</w:t>
-      </w:r>
-    </w:p>
-    <w:p>
-      <w:pPr>
-        <w:pStyle w:val="164"/>
-      </w:pPr>
-      <w:r>
-        <w:t>这一页不用讲，但要留着 —— 学生问「这张图哪来的」时直接翻到这里。本课的图像分四类来源：Wikimedia Commons 的自由许可图、V&amp;A 与 MoMu 两家博物馆的藏品页、品牌官方在线商店，以及 Vogue Runway 的秀场图（署名，仅用于课堂工序观察）。</w:t>
-      </w:r>
-    </w:p>
-    <w:p>
-      <w:pPr>
-        <w:pStyle w:val="166"/>
-      </w:pPr>
-      <w:r>
-        <w:t>补充 3｜其余来源，与两条需要说明的例外</w:t>
-      </w:r>
-    </w:p>
-    <w:p>
-      <w:pPr/>
-      <w:r>
-        <w:t>【讲稿】</w:t>
-      </w:r>
-    </w:p>
-    <w:p>
-      <w:pPr>
-        <w:pStyle w:val="164"/>
-      </w:pPr>
-      <w:r>
-        <w:t>附录 B 的来源表原来是一页八行，最后一行一直被底部的工具条挡住 —— 2026 年 9 月拆成了两页。这一页上半是来源表的后两行，下半是原来压在附录 B 下面的那两块说明。备课时记住两件事就够了：哪些图没有拿到授权、我用什么替代了它；以及 Chalayan 那两条 —— Airmail 的年代本课取 1999，两段最有名的画面本课没有图，要口述或放视频。</w:t>
-      </w:r>
-    </w:p>
-    <w:p>
-      <w:pPr>
-        <w:pStyle w:val="166"/>
-      </w:pPr>
-      <w:r>
-        <w:t>补充 4｜“反向设计”活动的进行方式与作业评价点</w:t>
-      </w:r>
-    </w:p>
-    <w:p>
-      <w:pPr/>
-      <w:r>
-        <w:t>【讲稿】</w:t>
-      </w:r>
-    </w:p>
-    <w:p>
-      <w:pPr>
-        <w:pStyle w:val="164"/>
-      </w:pPr>
-      <w:r>
-        <w:t>活动完全依赖开头热身画的那条裙子，所以第一句话就要提醒学生别把纸扔了。</w:t>
-      </w:r>
-    </w:p>
-    <w:p>
-      <w:pPr/>
-      <w:r>
-        <w:t>【作业四块的评分口径】</w:t>
-      </w:r>
-    </w:p>
-    <w:p>
-      <w:pPr>
-        <w:pStyle w:val="165"/>
-      </w:pPr>
-      <w:r>
-        <w:t>· 三个成见＋反例图（30%）：成见是否真的是自己的（而不是抄课件）；反例是否真能对应该成见。</w:t>
-      </w:r>
-    </w:p>
-    <w:p>
-      <w:pPr>
-        <w:pStyle w:val="165"/>
-      </w:pPr>
-      <w:r>
-        <w:t>· 我的入口流程图（25%）：是否从七种里做出选择并说明理由；是否诚实标出最弱的一步。</w:t>
-      </w:r>
-    </w:p>
-    <w:p>
-      <w:pPr>
-        <w:pStyle w:val="165"/>
-      </w:pPr>
-      <w:r>
-        <w:t>· 白布问题草图（20%）：是否有明确的造型决定（廓形 / 体积 / 细节至少一层）。</w:t>
-      </w:r>
-    </w:p>
-    <w:p>
-      <w:pPr>
-        <w:pStyle w:val="165"/>
-      </w:pPr>
-      <w:r>
-        <w:t>· 10 张参考图（25%）：中国 ≥3、国际 ≥3、非时装 ≥1；一句话是否指向某一层造型语言，而不是泛泛的「好看」。</w:t>
+        <w:t>这一页课上不放（附录 D）—— 原来的两分钟给了第 31 页的底稿，学生复习时自己翻；某个班时间有余，也可以拿它收尾。三句话：第一，成见不是错误，只是被当成了唯一答案——你今天看到的每个案例，都是有人把"唯一"变成了"之一"。第二，造型语言有三层：平面是语法，立体是声音，细节是语气；三层同时说话，才是一件完整的衣服。第三，设计的路不止一条，七个入口任你选，但每条路中间都要经过实验和筛选，跳过这两步就只是画画。</w:t>
       </w:r>
     </w:p>
     <w:sectPr>

</xml_diff>